<commit_message>
Actualización completa de la herramienta a 21 de enero
</commit_message>
<xml_diff>
--- a/Guias BibliometriaIPBLN/Guia Tecnica.docx
+++ b/Guias BibliometriaIPBLN/Guia Tecnica.docx
@@ -168,7 +168,6 @@
             <w:dataBinding w:prefixMappings="xmlns:ns0='http://purl.org/dc/elements/1.1/' xmlns:ns1='http://schemas.openxmlformats.org/package/2006/metadata/core-properties' " w:xpath="/ns1:coreProperties[1]/ns0:subject[1]" w:storeItemID="{6C3C8BC8-F283-45AE-878A-BAB7291924A1}"/>
             <w:text/>
           </w:sdtPr>
-          <w:sdtEndPr/>
           <w:sdtContent>
             <w:p>
               <w:pPr>
@@ -283,7 +282,6 @@
                                     <w:calendar w:val="gregorian"/>
                                   </w:date>
                                 </w:sdtPr>
-                                <w:sdtEndPr/>
                                 <w:sdtContent>
                                   <w:p>
                                     <w:pPr>
@@ -329,7 +327,6 @@
                                     <w:dataBinding w:prefixMappings="xmlns:ns0='http://schemas.openxmlformats.org/officeDocument/2006/extended-properties' " w:xpath="/ns0:Properties[1]/ns0:Company[1]" w:storeItemID="{6668398D-A668-4E3E-A5EB-62B293D839F1}"/>
                                     <w:text/>
                                   </w:sdtPr>
-                                  <w:sdtEndPr/>
                                   <w:sdtContent>
                                     <w:r>
                                       <w:rPr>
@@ -360,7 +357,6 @@
                                     <w:dataBinding w:prefixMappings="xmlns:ns0='http://schemas.microsoft.com/office/2006/coverPageProps' " w:xpath="/ns0:CoverPageProperties[1]/ns0:CompanyAddress[1]" w:storeItemID="{55AF091B-3C7A-41E3-B477-F2FDAA23CFDA}"/>
                                     <w:text/>
                                   </w:sdtPr>
-                                  <w:sdtEndPr/>
                                   <w:sdtContent>
                                     <w:r>
                                       <w:rPr>
@@ -1498,7 +1494,7 @@
                     <w:noProof/>
                     <w:webHidden/>
                   </w:rPr>
-                  <w:t>33</w:t>
+                  <w:t>34</w:t>
                 </w:r>
                 <w:r>
                   <w:rPr>
@@ -1585,7 +1581,7 @@
                     <w:noProof/>
                     <w:webHidden/>
                   </w:rPr>
-                  <w:t>36</w:t>
+                  <w:t>37</w:t>
                 </w:r>
                 <w:r>
                   <w:rPr>
@@ -7139,7 +7135,44 @@
           <w:sz w:val="22"/>
           <w:szCs w:val="22"/>
         </w:rPr>
-        <w:t>Lo primero que debemos hacer es bajar la base de datos desde el servidor, para ello, ejecutaremos el siguiente comando en la carpeta a la que queremos traer la base de datos:</w:t>
+        <w:t xml:space="preserve">Lo primero que debemos hacer </w:t>
+      </w:r>
+      <w:r>
+        <w:rPr>
+          <w:sz w:val="22"/>
+          <w:szCs w:val="22"/>
+        </w:rPr>
+        <w:t>es conectarnos a</w:t>
+      </w:r>
+      <w:r>
+        <w:rPr>
+          <w:sz w:val="22"/>
+          <w:szCs w:val="22"/>
+        </w:rPr>
+        <w:t xml:space="preserve">l servidor </w:t>
+      </w:r>
+      <w:proofErr w:type="spellStart"/>
+      <w:r>
+        <w:rPr>
+          <w:sz w:val="22"/>
+          <w:szCs w:val="22"/>
+        </w:rPr>
+        <w:t>hansolo</w:t>
+      </w:r>
+      <w:proofErr w:type="spellEnd"/>
+      <w:r>
+        <w:rPr>
+          <w:sz w:val="22"/>
+          <w:szCs w:val="22"/>
+        </w:rPr>
+        <w:t xml:space="preserve"> y </w:t>
+      </w:r>
+      <w:r>
+        <w:rPr>
+          <w:sz w:val="22"/>
+          <w:szCs w:val="22"/>
+        </w:rPr>
+        <w:t>para ello necesitamos estar conectados a la VPN del IPBLN y ejecutar el siguiente comando:</w:t>
       </w:r>
     </w:p>
     <w:p>
@@ -7158,7 +7191,6 @@
           <w:lang w:val="en-GB"/>
         </w:rPr>
       </w:pPr>
-      <w:proofErr w:type="spellStart"/>
       <w:r>
         <w:rPr>
           <w:i/>
@@ -7167,6 +7199,379 @@
           <w:szCs w:val="22"/>
           <w:lang w:val="en-GB"/>
         </w:rPr>
+        <w:t xml:space="preserve">ssh </w:t>
+      </w:r>
+      <w:hyperlink r:id="rId14" w:history="1">
+        <w:r>
+          <w:rPr>
+            <w:rStyle w:val="Hipervnculo"/>
+            <w:i/>
+            <w:iCs/>
+            <w:sz w:val="22"/>
+            <w:szCs w:val="22"/>
+            <w:lang w:val="en-GB"/>
+          </w:rPr>
+          <w:t>nombre_usuario@hansolo.ipb.csic.es</w:t>
+        </w:r>
+      </w:hyperlink>
+    </w:p>
+    <w:p>
+      <w:pPr>
+        <w:jc w:val="both"/>
+        <w:rPr>
+          <w:sz w:val="22"/>
+          <w:szCs w:val="22"/>
+        </w:rPr>
+      </w:pPr>
+      <w:r>
+        <w:rPr>
+          <w:sz w:val="22"/>
+          <w:szCs w:val="22"/>
+        </w:rPr>
+        <w:t>Foto de la VPN c</w:t>
+      </w:r>
+      <w:r>
+        <w:rPr>
+          <w:sz w:val="22"/>
+          <w:szCs w:val="22"/>
+        </w:rPr>
+        <w:t>onectada:</w:t>
+      </w:r>
+    </w:p>
+    <w:p>
+      <w:pPr>
+        <w:jc w:val="center"/>
+        <w:rPr>
+          <w:i/>
+          <w:iCs/>
+          <w:sz w:val="22"/>
+          <w:szCs w:val="22"/>
+          <w:lang w:val="en-GB"/>
+        </w:rPr>
+      </w:pPr>
+      <w:r>
+        <w:rPr>
+          <w:i/>
+          <w:iCs/>
+          <w:noProof/>
+          <w:sz w:val="22"/>
+          <w:szCs w:val="22"/>
+          <w:lang w:val="en-GB"/>
+        </w:rPr>
+        <w:lastRenderedPageBreak/>
+        <w:drawing>
+          <wp:inline distT="0" distB="0" distL="0" distR="0" wp14:anchorId="4DD30D58" wp14:editId="2D9C29C1">
+            <wp:extent cx="3290887" cy="2433337"/>
+            <wp:effectExtent l="0" t="0" r="5080" b="5080"/>
+            <wp:docPr id="97741358" name="Imagen 1" descr="Interfaz de usuario gráfica, Texto&#10;&#10;El contenido generado por IA puede ser incorrecto."/>
+            <wp:cNvGraphicFramePr>
+              <a:graphicFrameLocks xmlns:a="http://schemas.openxmlformats.org/drawingml/2006/main" noChangeAspect="1"/>
+            </wp:cNvGraphicFramePr>
+            <a:graphic xmlns:a="http://schemas.openxmlformats.org/drawingml/2006/main">
+              <a:graphicData uri="http://schemas.openxmlformats.org/drawingml/2006/picture">
+                <pic:pic xmlns:pic="http://schemas.openxmlformats.org/drawingml/2006/picture">
+                  <pic:nvPicPr>
+                    <pic:cNvPr id="97741358" name="Imagen 1" descr="Interfaz de usuario gráfica, Texto&#10;&#10;El contenido generado por IA puede ser incorrecto."/>
+                    <pic:cNvPicPr/>
+                  </pic:nvPicPr>
+                  <pic:blipFill>
+                    <a:blip r:embed="rId15"/>
+                    <a:stretch>
+                      <a:fillRect/>
+                    </a:stretch>
+                  </pic:blipFill>
+                  <pic:spPr>
+                    <a:xfrm>
+                      <a:off x="0" y="0"/>
+                      <a:ext cx="3298222" cy="2438760"/>
+                    </a:xfrm>
+                    <a:prstGeom prst="rect">
+                      <a:avLst/>
+                    </a:prstGeom>
+                  </pic:spPr>
+                </pic:pic>
+              </a:graphicData>
+            </a:graphic>
+          </wp:inline>
+        </w:drawing>
+      </w:r>
+    </w:p>
+    <w:p>
+      <w:pPr>
+        <w:jc w:val="both"/>
+        <w:rPr>
+          <w:sz w:val="22"/>
+          <w:szCs w:val="22"/>
+          <w:lang w:val="en-GB"/>
+        </w:rPr>
+      </w:pPr>
+    </w:p>
+    <w:p>
+      <w:pPr>
+        <w:jc w:val="both"/>
+        <w:rPr>
+          <w:sz w:val="22"/>
+          <w:szCs w:val="22"/>
+          <w:lang w:val="en-GB"/>
+        </w:rPr>
+      </w:pPr>
+    </w:p>
+    <w:p>
+      <w:pPr>
+        <w:jc w:val="both"/>
+        <w:rPr>
+          <w:sz w:val="22"/>
+          <w:szCs w:val="22"/>
+        </w:rPr>
+      </w:pPr>
+      <w:r>
+        <w:rPr>
+          <w:sz w:val="22"/>
+          <w:szCs w:val="22"/>
+        </w:rPr>
+        <w:t>Una vez dentro debemos detener el proceso que mantiene la aplicación, de esta manera no se registrarán nuevos usuarios mientras hacemos todo el proceso de actualización. Para ello:</w:t>
+      </w:r>
+    </w:p>
+    <w:p>
+      <w:pPr>
+        <w:pStyle w:val="Prrafodelista"/>
+        <w:numPr>
+          <w:ilvl w:val="0"/>
+          <w:numId w:val="28"/>
+        </w:numPr>
+        <w:jc w:val="both"/>
+        <w:rPr>
+          <w:i/>
+          <w:iCs/>
+          <w:sz w:val="22"/>
+          <w:szCs w:val="22"/>
+        </w:rPr>
+      </w:pPr>
+      <w:proofErr w:type="spellStart"/>
+      <w:r>
+        <w:rPr>
+          <w:i/>
+          <w:iCs/>
+          <w:sz w:val="22"/>
+          <w:szCs w:val="22"/>
+        </w:rPr>
+        <w:t>ss</w:t>
+      </w:r>
+      <w:proofErr w:type="spellEnd"/>
+      <w:r>
+        <w:rPr>
+          <w:i/>
+          <w:iCs/>
+          <w:sz w:val="22"/>
+          <w:szCs w:val="22"/>
+        </w:rPr>
+        <w:t xml:space="preserve"> -</w:t>
+      </w:r>
+      <w:proofErr w:type="spellStart"/>
+      <w:r>
+        <w:rPr>
+          <w:i/>
+          <w:iCs/>
+          <w:sz w:val="22"/>
+          <w:szCs w:val="22"/>
+        </w:rPr>
+        <w:t>ltnp</w:t>
+      </w:r>
+      <w:proofErr w:type="spellEnd"/>
+      <w:r>
+        <w:rPr>
+          <w:i/>
+          <w:iCs/>
+          <w:sz w:val="22"/>
+          <w:szCs w:val="22"/>
+        </w:rPr>
+        <w:t xml:space="preserve"> | grep 8001</w:t>
+      </w:r>
+    </w:p>
+    <w:p>
+      <w:pPr>
+        <w:pStyle w:val="Prrafodelista"/>
+        <w:numPr>
+          <w:ilvl w:val="0"/>
+          <w:numId w:val="28"/>
+        </w:numPr>
+        <w:jc w:val="both"/>
+        <w:rPr>
+          <w:sz w:val="22"/>
+          <w:szCs w:val="22"/>
+        </w:rPr>
+      </w:pPr>
+      <w:proofErr w:type="spellStart"/>
+      <w:r>
+        <w:rPr>
+          <w:sz w:val="22"/>
+          <w:szCs w:val="22"/>
+        </w:rPr>
+        <w:t>kill</w:t>
+      </w:r>
+      <w:proofErr w:type="spellEnd"/>
+      <w:r>
+        <w:rPr>
+          <w:sz w:val="22"/>
+          <w:szCs w:val="22"/>
+        </w:rPr>
+        <w:t xml:space="preserve"> -9 </w:t>
+      </w:r>
+      <w:proofErr w:type="spellStart"/>
+      <w:r>
+        <w:rPr>
+          <w:sz w:val="22"/>
+          <w:szCs w:val="22"/>
+        </w:rPr>
+        <w:t>pid</w:t>
+      </w:r>
+      <w:proofErr w:type="spellEnd"/>
+    </w:p>
+    <w:p>
+      <w:pPr>
+        <w:jc w:val="both"/>
+        <w:rPr>
+          <w:sz w:val="22"/>
+          <w:szCs w:val="22"/>
+        </w:rPr>
+      </w:pPr>
+      <w:r>
+        <w:rPr>
+          <w:noProof/>
+          <w:sz w:val="22"/>
+          <w:szCs w:val="22"/>
+        </w:rPr>
+        <w:drawing>
+          <wp:inline distT="0" distB="0" distL="0" distR="0" wp14:anchorId="2C874BB5" wp14:editId="06F29E95">
+            <wp:extent cx="5400040" cy="596265"/>
+            <wp:effectExtent l="0" t="0" r="0" b="0"/>
+            <wp:docPr id="1780399001" name="Imagen 1"/>
+            <wp:cNvGraphicFramePr>
+              <a:graphicFrameLocks xmlns:a="http://schemas.openxmlformats.org/drawingml/2006/main" noChangeAspect="1"/>
+            </wp:cNvGraphicFramePr>
+            <a:graphic xmlns:a="http://schemas.openxmlformats.org/drawingml/2006/main">
+              <a:graphicData uri="http://schemas.openxmlformats.org/drawingml/2006/picture">
+                <pic:pic xmlns:pic="http://schemas.openxmlformats.org/drawingml/2006/picture">
+                  <pic:nvPicPr>
+                    <pic:cNvPr id="1780399001" name=""/>
+                    <pic:cNvPicPr/>
+                  </pic:nvPicPr>
+                  <pic:blipFill>
+                    <a:blip r:embed="rId16"/>
+                    <a:stretch>
+                      <a:fillRect/>
+                    </a:stretch>
+                  </pic:blipFill>
+                  <pic:spPr>
+                    <a:xfrm>
+                      <a:off x="0" y="0"/>
+                      <a:ext cx="5400040" cy="596265"/>
+                    </a:xfrm>
+                    <a:prstGeom prst="rect">
+                      <a:avLst/>
+                    </a:prstGeom>
+                  </pic:spPr>
+                </pic:pic>
+              </a:graphicData>
+            </a:graphic>
+          </wp:inline>
+        </w:drawing>
+      </w:r>
+    </w:p>
+    <w:p>
+      <w:pPr>
+        <w:jc w:val="both"/>
+        <w:rPr>
+          <w:sz w:val="22"/>
+          <w:szCs w:val="22"/>
+        </w:rPr>
+      </w:pPr>
+      <w:r>
+        <w:rPr>
+          <w:sz w:val="22"/>
+          <w:szCs w:val="22"/>
+        </w:rPr>
+        <w:t xml:space="preserve">Una vez hecho esto ejecutamos </w:t>
+      </w:r>
+      <w:proofErr w:type="spellStart"/>
+      <w:r>
+        <w:rPr>
+          <w:sz w:val="22"/>
+          <w:szCs w:val="22"/>
+        </w:rPr>
+        <w:t>exit</w:t>
+      </w:r>
+      <w:proofErr w:type="spellEnd"/>
+      <w:r>
+        <w:rPr>
+          <w:sz w:val="22"/>
+          <w:szCs w:val="22"/>
+        </w:rPr>
+        <w:t xml:space="preserve"> y volvemos a nuestra terminal del ordenador.</w:t>
+      </w:r>
+    </w:p>
+    <w:p>
+      <w:pPr>
+        <w:jc w:val="both"/>
+        <w:rPr>
+          <w:sz w:val="22"/>
+          <w:szCs w:val="22"/>
+        </w:rPr>
+      </w:pPr>
+      <w:r>
+        <w:rPr>
+          <w:sz w:val="22"/>
+          <w:szCs w:val="22"/>
+        </w:rPr>
+        <w:t xml:space="preserve">Lo siguiente </w:t>
+      </w:r>
+      <w:r>
+        <w:rPr>
+          <w:sz w:val="22"/>
+          <w:szCs w:val="22"/>
+        </w:rPr>
+        <w:t>es bajar la base de datos desde el servidor, para ello, ejecutaremos el siguiente comando en la carpeta a la que queremos traer la base de datos</w:t>
+      </w:r>
+      <w:r>
+        <w:rPr>
+          <w:sz w:val="22"/>
+          <w:szCs w:val="22"/>
+        </w:rPr>
+        <w:t xml:space="preserve"> (recomendablemente la que esté justo encima de App, donde se encuentra todo el proyecto)</w:t>
+      </w:r>
+      <w:r>
+        <w:rPr>
+          <w:sz w:val="22"/>
+          <w:szCs w:val="22"/>
+        </w:rPr>
+        <w:t>:</w:t>
+      </w:r>
+    </w:p>
+    <w:p>
+      <w:pPr>
+        <w:pStyle w:val="Prrafodelista"/>
+        <w:numPr>
+          <w:ilvl w:val="0"/>
+          <w:numId w:val="27"/>
+        </w:numPr>
+        <w:jc w:val="both"/>
+        <w:rPr>
+          <w:i/>
+          <w:iCs/>
+          <w:sz w:val="22"/>
+          <w:szCs w:val="22"/>
+          <w:lang w:val="en-GB"/>
+        </w:rPr>
+      </w:pPr>
+      <w:proofErr w:type="spellStart"/>
+      <w:r>
+        <w:rPr>
+          <w:i/>
+          <w:iCs/>
+          <w:sz w:val="22"/>
+          <w:szCs w:val="22"/>
+          <w:lang w:val="en-GB"/>
+        </w:rPr>
         <w:t>scp</w:t>
       </w:r>
       <w:proofErr w:type="spellEnd"/>
@@ -7228,77 +7633,84 @@
           <w:sz w:val="22"/>
           <w:szCs w:val="22"/>
         </w:rPr>
+        <w:t>Lue</w:t>
+      </w:r>
+      <w:r>
+        <w:rPr>
+          <w:sz w:val="22"/>
+          <w:szCs w:val="22"/>
+        </w:rPr>
+        <w:t>g</w:t>
+      </w:r>
+      <w:r>
+        <w:rPr>
+          <w:sz w:val="22"/>
+          <w:szCs w:val="22"/>
+        </w:rPr>
+        <w:t xml:space="preserve">o debemos cambiar el nombre de la base de datos a </w:t>
+      </w:r>
+      <w:proofErr w:type="gramStart"/>
+      <w:r>
+        <w:rPr>
+          <w:sz w:val="22"/>
+          <w:szCs w:val="22"/>
+        </w:rPr>
+        <w:t>server</w:t>
+      </w:r>
+      <w:proofErr w:type="gramEnd"/>
+      <w:r>
+        <w:rPr>
+          <w:sz w:val="22"/>
+          <w:szCs w:val="22"/>
+        </w:rPr>
+        <w:t>.sqlite3 y la debemos colocar en el directorio raíz de nuestro proyecto, de tal manera que veamos dos bases de datos</w:t>
+      </w:r>
+      <w:r>
+        <w:rPr>
+          <w:sz w:val="22"/>
+          <w:szCs w:val="22"/>
+        </w:rPr>
+        <w:t xml:space="preserve">, para ello, si previamente tenías un archivo llamado </w:t>
+      </w:r>
+      <w:proofErr w:type="gramStart"/>
+      <w:r>
+        <w:rPr>
+          <w:sz w:val="22"/>
+          <w:szCs w:val="22"/>
+        </w:rPr>
+        <w:t>server</w:t>
+      </w:r>
+      <w:proofErr w:type="gramEnd"/>
+      <w:r>
+        <w:rPr>
+          <w:sz w:val="22"/>
+          <w:szCs w:val="22"/>
+        </w:rPr>
+        <w:t>.sqlite3, puedes eliminarlo, cambiar el nombre al que te acabas de bajar y ponerlo donde estaba el anterior</w:t>
+      </w:r>
+      <w:r>
+        <w:rPr>
+          <w:sz w:val="22"/>
+          <w:szCs w:val="22"/>
+        </w:rPr>
+        <w:t>:</w:t>
+      </w:r>
+    </w:p>
+    <w:p>
+      <w:pPr>
+        <w:jc w:val="center"/>
+        <w:rPr>
+          <w:sz w:val="22"/>
+          <w:szCs w:val="22"/>
+        </w:rPr>
+      </w:pPr>
+      <w:r>
+        <w:rPr>
+          <w:noProof/>
+          <w:sz w:val="22"/>
+          <w:szCs w:val="22"/>
+        </w:rPr>
         <w:lastRenderedPageBreak/>
-        <w:t>S</w:t>
-      </w:r>
-      <w:r>
-        <w:rPr>
-          <w:sz w:val="22"/>
-          <w:szCs w:val="22"/>
-        </w:rPr>
-        <w:t xml:space="preserve">i no funciona necesitaremos hacerlo a través de </w:t>
-      </w:r>
-      <w:proofErr w:type="spellStart"/>
-      <w:r>
-        <w:rPr>
-          <w:sz w:val="22"/>
-          <w:szCs w:val="22"/>
-        </w:rPr>
-        <w:t>halowan</w:t>
-      </w:r>
-      <w:proofErr w:type="spellEnd"/>
-      <w:r>
-        <w:rPr>
-          <w:sz w:val="22"/>
-          <w:szCs w:val="22"/>
-        </w:rPr>
-        <w:t xml:space="preserve"> primero. Lue</w:t>
-      </w:r>
-      <w:r>
-        <w:rPr>
-          <w:sz w:val="22"/>
-          <w:szCs w:val="22"/>
-        </w:rPr>
-        <w:t>g</w:t>
-      </w:r>
-      <w:r>
-        <w:rPr>
-          <w:sz w:val="22"/>
-          <w:szCs w:val="22"/>
-        </w:rPr>
-        <w:t xml:space="preserve">o debemos cambiar el nombre de la base de datos a </w:t>
-      </w:r>
-      <w:proofErr w:type="gramStart"/>
-      <w:r>
-        <w:rPr>
-          <w:sz w:val="22"/>
-          <w:szCs w:val="22"/>
-        </w:rPr>
-        <w:t>server</w:t>
-      </w:r>
-      <w:proofErr w:type="gramEnd"/>
-      <w:r>
-        <w:rPr>
-          <w:sz w:val="22"/>
-          <w:szCs w:val="22"/>
-        </w:rPr>
-        <w:t>.sqlite3 y la debemos colocar en el directorio raíz de nuestro proyecto, de tal manera que veamos dos bases de datos:</w:t>
-      </w:r>
-    </w:p>
-    <w:p>
-      <w:pPr>
-        <w:jc w:val="center"/>
-        <w:rPr>
-          <w:sz w:val="22"/>
-          <w:szCs w:val="22"/>
-        </w:rPr>
-      </w:pPr>
-      <w:r>
-        <w:rPr>
-          <w:noProof/>
-          <w:sz w:val="22"/>
-          <w:szCs w:val="22"/>
-        </w:rPr>
         <w:drawing>
           <wp:inline distT="0" distB="0" distL="0" distR="0" wp14:anchorId="5B7E8C81" wp14:editId="775E2ACA">
             <wp:extent cx="1323985" cy="1504961"/>
@@ -7315,7 +7727,7 @@
                     <pic:cNvPicPr/>
                   </pic:nvPicPr>
                   <pic:blipFill>
-                    <a:blip r:embed="rId14"/>
+                    <a:blip r:embed="rId17"/>
                     <a:stretch>
                       <a:fillRect/>
                     </a:stretch>
@@ -7411,132 +7823,65 @@
           <w:sz w:val="22"/>
           <w:szCs w:val="22"/>
         </w:rPr>
-        <w:t xml:space="preserve">ra base de datos local, con los usuarios reales de nuestra aplicación y podremos empezar con el proceso de actualización de la aplicación completo. </w:t>
-      </w:r>
-      <w:r>
-        <w:rPr>
-          <w:sz w:val="22"/>
-          <w:szCs w:val="22"/>
-        </w:rPr>
-        <w:t xml:space="preserve">Se recomienda </w:t>
-      </w:r>
-      <w:r>
-        <w:rPr>
-          <w:sz w:val="22"/>
-          <w:szCs w:val="22"/>
-        </w:rPr>
-        <w:t>mantener el servidor caído durante todo el proceso para que no se puedan registrar nuevos usuarios. Se hace con los comandos:</w:t>
-      </w:r>
-    </w:p>
-    <w:p>
-      <w:pPr>
-        <w:pStyle w:val="Prrafodelista"/>
-        <w:numPr>
-          <w:ilvl w:val="0"/>
-          <w:numId w:val="28"/>
-        </w:numPr>
-        <w:jc w:val="both"/>
-        <w:rPr>
-          <w:i/>
-          <w:iCs/>
-          <w:sz w:val="22"/>
-          <w:szCs w:val="22"/>
-        </w:rPr>
-      </w:pPr>
-      <w:proofErr w:type="spellStart"/>
-      <w:r>
-        <w:rPr>
-          <w:i/>
-          <w:iCs/>
-          <w:sz w:val="22"/>
-          <w:szCs w:val="22"/>
-        </w:rPr>
-        <w:t>ss</w:t>
-      </w:r>
-      <w:proofErr w:type="spellEnd"/>
-      <w:r>
-        <w:rPr>
-          <w:i/>
-          <w:iCs/>
-          <w:sz w:val="22"/>
-          <w:szCs w:val="22"/>
-        </w:rPr>
-        <w:t xml:space="preserve"> -</w:t>
-      </w:r>
-      <w:proofErr w:type="spellStart"/>
-      <w:r>
-        <w:rPr>
-          <w:i/>
-          <w:iCs/>
-          <w:sz w:val="22"/>
-          <w:szCs w:val="22"/>
-        </w:rPr>
-        <w:t>ltnp</w:t>
-      </w:r>
-      <w:proofErr w:type="spellEnd"/>
-      <w:r>
-        <w:rPr>
-          <w:i/>
-          <w:iCs/>
-          <w:sz w:val="22"/>
-          <w:szCs w:val="22"/>
-        </w:rPr>
-        <w:t xml:space="preserve"> | grep 8001</w:t>
-      </w:r>
-    </w:p>
-    <w:p>
-      <w:pPr>
-        <w:pStyle w:val="Prrafodelista"/>
-        <w:numPr>
-          <w:ilvl w:val="0"/>
-          <w:numId w:val="28"/>
-        </w:numPr>
-        <w:jc w:val="both"/>
-        <w:rPr>
-          <w:sz w:val="22"/>
-          <w:szCs w:val="22"/>
-        </w:rPr>
-      </w:pPr>
-      <w:proofErr w:type="spellStart"/>
-      <w:r>
-        <w:rPr>
-          <w:sz w:val="22"/>
-          <w:szCs w:val="22"/>
-        </w:rPr>
-        <w:t>kill</w:t>
-      </w:r>
-      <w:proofErr w:type="spellEnd"/>
-      <w:r>
-        <w:rPr>
-          <w:sz w:val="22"/>
-          <w:szCs w:val="22"/>
-        </w:rPr>
-        <w:t xml:space="preserve"> -9 </w:t>
-      </w:r>
-      <w:proofErr w:type="spellStart"/>
-      <w:r>
-        <w:rPr>
-          <w:sz w:val="22"/>
-          <w:szCs w:val="22"/>
-        </w:rPr>
-        <w:t>pid</w:t>
-      </w:r>
-      <w:proofErr w:type="spellEnd"/>
-    </w:p>
-    <w:p>
-      <w:pPr>
-        <w:jc w:val="both"/>
-        <w:rPr>
-          <w:sz w:val="22"/>
-          <w:szCs w:val="22"/>
-        </w:rPr>
-      </w:pPr>
-      <w:r>
-        <w:rPr>
-          <w:sz w:val="22"/>
-          <w:szCs w:val="22"/>
-        </w:rPr>
-        <w:t>Esto se explica todo en la sección de despliegue.</w:t>
+        <w:t>ra base de datos local, con los usuarios reales de nuestra aplicación y podremos empezar con el proceso de actualización de la aplicación completo</w:t>
+      </w:r>
+      <w:r>
+        <w:rPr>
+          <w:sz w:val="22"/>
+          <w:szCs w:val="22"/>
+        </w:rPr>
+        <w:t>:</w:t>
+      </w:r>
+    </w:p>
+    <w:p>
+      <w:pPr>
+        <w:jc w:val="both"/>
+        <w:rPr>
+          <w:sz w:val="22"/>
+          <w:szCs w:val="22"/>
+        </w:rPr>
+      </w:pPr>
+      <w:r>
+        <w:rPr>
+          <w:noProof/>
+          <w:sz w:val="22"/>
+          <w:szCs w:val="22"/>
+        </w:rPr>
+        <w:drawing>
+          <wp:inline distT="0" distB="0" distL="0" distR="0" wp14:anchorId="65397977" wp14:editId="78A19A18">
+            <wp:extent cx="5400040" cy="890270"/>
+            <wp:effectExtent l="0" t="0" r="0" b="5080"/>
+            <wp:docPr id="45401884" name="Imagen 1" descr="Texto&#10;&#10;El contenido generado por IA puede ser incorrecto."/>
+            <wp:cNvGraphicFramePr>
+              <a:graphicFrameLocks xmlns:a="http://schemas.openxmlformats.org/drawingml/2006/main" noChangeAspect="1"/>
+            </wp:cNvGraphicFramePr>
+            <a:graphic xmlns:a="http://schemas.openxmlformats.org/drawingml/2006/main">
+              <a:graphicData uri="http://schemas.openxmlformats.org/drawingml/2006/picture">
+                <pic:pic xmlns:pic="http://schemas.openxmlformats.org/drawingml/2006/picture">
+                  <pic:nvPicPr>
+                    <pic:cNvPr id="45401884" name="Imagen 1" descr="Texto&#10;&#10;El contenido generado por IA puede ser incorrecto."/>
+                    <pic:cNvPicPr/>
+                  </pic:nvPicPr>
+                  <pic:blipFill>
+                    <a:blip r:embed="rId18"/>
+                    <a:stretch>
+                      <a:fillRect/>
+                    </a:stretch>
+                  </pic:blipFill>
+                  <pic:spPr>
+                    <a:xfrm>
+                      <a:off x="0" y="0"/>
+                      <a:ext cx="5400040" cy="890270"/>
+                    </a:xfrm>
+                    <a:prstGeom prst="rect">
+                      <a:avLst/>
+                    </a:prstGeom>
+                  </pic:spPr>
+                </pic:pic>
+              </a:graphicData>
+            </a:graphic>
+          </wp:inline>
+        </w:drawing>
       </w:r>
     </w:p>
     <w:p>
@@ -7615,7 +7960,7 @@
                     <pic:cNvPicPr/>
                   </pic:nvPicPr>
                   <pic:blipFill>
-                    <a:blip r:embed="rId15"/>
+                    <a:blip r:embed="rId19"/>
                     <a:stretch>
                       <a:fillRect/>
                     </a:stretch>
@@ -7666,7 +8011,6 @@
           <w:sz w:val="22"/>
           <w:szCs w:val="22"/>
         </w:rPr>
-        <w:lastRenderedPageBreak/>
         <w:drawing>
           <wp:inline distT="0" distB="0" distL="0" distR="0" wp14:anchorId="2527325E" wp14:editId="6755A95A">
             <wp:extent cx="3076575" cy="2126903"/>
@@ -7683,7 +8027,7 @@
                     <pic:cNvPicPr/>
                   </pic:nvPicPr>
                   <pic:blipFill>
-                    <a:blip r:embed="rId16"/>
+                    <a:blip r:embed="rId20"/>
                     <a:stretch>
                       <a:fillRect/>
                     </a:stretch>
@@ -7717,6 +8061,7 @@
           <w:sz w:val="22"/>
           <w:szCs w:val="22"/>
         </w:rPr>
+        <w:lastRenderedPageBreak/>
         <w:t xml:space="preserve">Bien, ahora puedes borrar todo lo que hay en las carpetas </w:t>
       </w:r>
       <w:proofErr w:type="spellStart"/>
@@ -7805,7 +8150,7 @@
                     <pic:cNvPicPr/>
                   </pic:nvPicPr>
                   <pic:blipFill>
-                    <a:blip r:embed="rId17"/>
+                    <a:blip r:embed="rId21"/>
                     <a:stretch>
                       <a:fillRect/>
                     </a:stretch>
@@ -8116,7 +8461,7 @@
         </w:rPr>
         <w:t xml:space="preserve">: </w:t>
       </w:r>
-      <w:hyperlink r:id="rId18" w:history="1">
+      <w:hyperlink r:id="rId22" w:history="1">
         <w:r>
           <w:rPr>
             <w:rStyle w:val="Hipervnculo"/>
@@ -8412,7 +8757,6 @@
           <w:sz w:val="22"/>
           <w:szCs w:val="22"/>
         </w:rPr>
-        <w:lastRenderedPageBreak/>
         <w:t>En los apartados de USU</w:t>
       </w:r>
       <w:r>
@@ -8532,7 +8876,15 @@
           <w:sz w:val="22"/>
           <w:szCs w:val="22"/>
         </w:rPr>
-        <w:t>, entonces, es necesario meterse en cada uno de estos comandos y adaptar el código para que funcionen atendiendo a las nuevas webs.</w:t>
+        <w:t xml:space="preserve">, entonces, es necesario meterse en cada uno de estos </w:t>
+      </w:r>
+      <w:r>
+        <w:rPr>
+          <w:sz w:val="22"/>
+          <w:szCs w:val="22"/>
+        </w:rPr>
+        <w:lastRenderedPageBreak/>
+        <w:t>comandos y adaptar el código para que funcionen atendiendo a las nuevas webs.</w:t>
       </w:r>
       <w:r>
         <w:rPr>
@@ -8689,7 +9041,7 @@
                     <pic:cNvPicPr/>
                   </pic:nvPicPr>
                   <pic:blipFill>
-                    <a:blip r:embed="rId19"/>
+                    <a:blip r:embed="rId23"/>
                     <a:stretch>
                       <a:fillRect/>
                     </a:stretch>
@@ -8886,7 +9238,6 @@
           <w:sz w:val="22"/>
           <w:szCs w:val="22"/>
         </w:rPr>
-        <w:lastRenderedPageBreak/>
         <w:drawing>
           <wp:inline distT="0" distB="0" distL="0" distR="0" wp14:anchorId="07B8757E" wp14:editId="253F7A6A">
             <wp:extent cx="3505200" cy="1682240"/>
@@ -8903,7 +9254,7 @@
                     <pic:cNvPicPr/>
                   </pic:nvPicPr>
                   <pic:blipFill>
-                    <a:blip r:embed="rId20"/>
+                    <a:blip r:embed="rId24"/>
                     <a:stretch>
                       <a:fillRect/>
                     </a:stretch>
@@ -9032,7 +9383,15 @@
           <w:sz w:val="22"/>
           <w:szCs w:val="22"/>
         </w:rPr>
-        <w:t xml:space="preserve"> (en el momento que estoy escribiendo esto, sólo hay 3 páginas de autores) en un fichero. Al finalizar el proceso deberías ver el nuevo </w:t>
+        <w:t xml:space="preserve"> (en el </w:t>
+      </w:r>
+      <w:r>
+        <w:rPr>
+          <w:sz w:val="22"/>
+          <w:szCs w:val="22"/>
+        </w:rPr>
+        <w:lastRenderedPageBreak/>
+        <w:t xml:space="preserve">momento que estoy escribiendo esto, sólo hay 3 páginas de autores) en un fichero. Al finalizar el proceso deberías ver el nuevo </w:t>
       </w:r>
       <w:proofErr w:type="gramStart"/>
       <w:r>
@@ -9090,7 +9449,7 @@
                     <pic:cNvPicPr/>
                   </pic:nvPicPr>
                   <pic:blipFill>
-                    <a:blip r:embed="rId21"/>
+                    <a:blip r:embed="rId25"/>
                     <a:stretch>
                       <a:fillRect/>
                     </a:stretch>
@@ -9140,23 +9499,7 @@
           <w:sz w:val="22"/>
           <w:szCs w:val="22"/>
         </w:rPr>
-        <w:t xml:space="preserve"> para el IBPLN, sino coincide, vuelve a ejecutar </w:t>
-      </w:r>
-      <w:proofErr w:type="gramStart"/>
-      <w:r>
-        <w:rPr>
-          <w:sz w:val="22"/>
-          <w:szCs w:val="22"/>
-        </w:rPr>
-        <w:t>el  comando</w:t>
-      </w:r>
-      <w:proofErr w:type="gramEnd"/>
-      <w:r>
-        <w:rPr>
-          <w:sz w:val="22"/>
-          <w:szCs w:val="22"/>
-        </w:rPr>
-        <w:t xml:space="preserve"> y puedes añadir tiempos de espera más largos en el código del comando para que cargue bien todas las páginas</w:t>
+        <w:t xml:space="preserve"> para el IBPLN, sino coincide, vuelve a ejecutar el comando y puedes añadir tiempos de espera más largos en el código del comando para que cargue bien todas las páginas</w:t>
       </w:r>
       <w:r>
         <w:rPr>
@@ -9282,7 +9625,6 @@
           <w:sz w:val="22"/>
           <w:szCs w:val="22"/>
         </w:rPr>
-        <w:lastRenderedPageBreak/>
         <w:drawing>
           <wp:inline distT="0" distB="0" distL="0" distR="0" wp14:anchorId="653DF78E" wp14:editId="3FCCA2A1">
             <wp:extent cx="5400040" cy="1746250"/>
@@ -9299,7 +9641,7 @@
                     <pic:cNvPicPr/>
                   </pic:nvPicPr>
                   <pic:blipFill>
-                    <a:blip r:embed="rId22"/>
+                    <a:blip r:embed="rId26"/>
                     <a:stretch>
                       <a:fillRect/>
                     </a:stretch>
@@ -9364,6 +9706,7 @@
           <w:sz w:val="22"/>
           <w:szCs w:val="22"/>
         </w:rPr>
+        <w:lastRenderedPageBreak/>
         <w:drawing>
           <wp:inline distT="0" distB="0" distL="0" distR="0" wp14:anchorId="024066C1" wp14:editId="5CCE14F2">
             <wp:extent cx="2886075" cy="1814408"/>
@@ -9380,7 +9723,7 @@
                     <pic:cNvPicPr/>
                   </pic:nvPicPr>
                   <pic:blipFill>
-                    <a:blip r:embed="rId23"/>
+                    <a:blip r:embed="rId27"/>
                     <a:stretch>
                       <a:fillRect/>
                     </a:stretch>
@@ -9432,6 +9775,20 @@
         </w:rPr>
         <w:t xml:space="preserve"> del IPBLN. </w:t>
       </w:r>
+      <w:r>
+        <w:rPr>
+          <w:sz w:val="22"/>
+          <w:szCs w:val="22"/>
+        </w:rPr>
+        <w:t>Sino coincide, borra el archivo y vuelve a ejecutar el comando, si quieres puedes aumentar los tiempos de espera en el código</w:t>
+      </w:r>
+      <w:r>
+        <w:rPr>
+          <w:sz w:val="22"/>
+          <w:szCs w:val="22"/>
+        </w:rPr>
+        <w:t>.</w:t>
+      </w:r>
     </w:p>
     <w:p>
       <w:pPr>
@@ -9616,7 +9973,7 @@
                     <pic:cNvPicPr/>
                   </pic:nvPicPr>
                   <pic:blipFill>
-                    <a:blip r:embed="rId24"/>
+                    <a:blip r:embed="rId28"/>
                     <a:stretch>
                       <a:fillRect/>
                     </a:stretch>
@@ -9687,215 +10044,208 @@
           <w:sz w:val="22"/>
           <w:szCs w:val="22"/>
         </w:rPr>
-        <w:t xml:space="preserve"> que se van </w:t>
-      </w:r>
+        <w:t xml:space="preserve"> que se van activando, cambian ligeramente</w:t>
+      </w:r>
+      <w:r>
+        <w:rPr>
+          <w:sz w:val="22"/>
+          <w:szCs w:val="22"/>
+        </w:rPr>
+        <w:t>. Si no te funciona o encuentras algún problema puedes intentar actualizar el comando en el código o ponerte en contacto con alguien que te ayude.</w:t>
+      </w:r>
+    </w:p>
+    <w:p>
+      <w:pPr>
+        <w:pStyle w:val="Ttulo6"/>
+      </w:pPr>
+      <w:r>
+        <w:t>5</w:t>
+      </w:r>
+      <w:r>
+        <w:t xml:space="preserve">.2.2. </w:t>
+      </w:r>
+      <w:r>
+        <w:t>pasar los datos a formato csv</w:t>
+      </w:r>
+    </w:p>
+    <w:p>
+      <w:pPr>
+        <w:jc w:val="both"/>
+        <w:rPr>
+          <w:sz w:val="22"/>
+          <w:szCs w:val="22"/>
+        </w:rPr>
+      </w:pPr>
+      <w:r>
+        <w:rPr>
+          <w:sz w:val="22"/>
+          <w:szCs w:val="22"/>
+        </w:rPr>
+        <w:t xml:space="preserve">Una vez extraídos los </w:t>
+      </w:r>
+      <w:proofErr w:type="gramStart"/>
+      <w:r>
+        <w:rPr>
+          <w:sz w:val="22"/>
+          <w:szCs w:val="22"/>
+        </w:rPr>
+        <w:t>ficheros .</w:t>
+      </w:r>
+      <w:proofErr w:type="spellStart"/>
+      <w:r>
+        <w:rPr>
+          <w:sz w:val="22"/>
+          <w:szCs w:val="22"/>
+        </w:rPr>
+        <w:t>jsonl</w:t>
+      </w:r>
+      <w:proofErr w:type="spellEnd"/>
+      <w:proofErr w:type="gramEnd"/>
+      <w:r>
+        <w:rPr>
+          <w:sz w:val="22"/>
+          <w:szCs w:val="22"/>
+        </w:rPr>
+        <w:t xml:space="preserve">, </w:t>
+      </w:r>
+      <w:r>
+        <w:rPr>
+          <w:sz w:val="22"/>
+          <w:szCs w:val="22"/>
+        </w:rPr>
+        <w:t>toca convertirlos a .</w:t>
+      </w:r>
+      <w:proofErr w:type="spellStart"/>
+      <w:r>
+        <w:rPr>
+          <w:sz w:val="22"/>
+          <w:szCs w:val="22"/>
+        </w:rPr>
+        <w:t>csv</w:t>
+      </w:r>
+      <w:proofErr w:type="spellEnd"/>
+      <w:r>
+        <w:rPr>
+          <w:sz w:val="22"/>
+          <w:szCs w:val="22"/>
+        </w:rPr>
+        <w:t xml:space="preserve">. Para ello </w:t>
+      </w:r>
+      <w:r>
+        <w:rPr>
+          <w:sz w:val="22"/>
+          <w:szCs w:val="22"/>
+        </w:rPr>
+        <w:t xml:space="preserve">seguiremos los siguientes pasos. Debemos acceder a </w:t>
+      </w:r>
+      <w:r>
+        <w:rPr>
+          <w:i/>
+          <w:iCs/>
+          <w:sz w:val="22"/>
+          <w:szCs w:val="22"/>
+        </w:rPr>
+        <w:t>data/</w:t>
+      </w:r>
+      <w:proofErr w:type="spellStart"/>
+      <w:r>
+        <w:rPr>
+          <w:i/>
+          <w:iCs/>
+          <w:sz w:val="22"/>
+          <w:szCs w:val="22"/>
+        </w:rPr>
+        <w:t>saveCSV</w:t>
+      </w:r>
+      <w:proofErr w:type="spellEnd"/>
+      <w:r>
+        <w:rPr>
+          <w:i/>
+          <w:iCs/>
+          <w:sz w:val="22"/>
+          <w:szCs w:val="22"/>
+        </w:rPr>
+        <w:t>/</w:t>
+      </w:r>
+      <w:r>
+        <w:rPr>
+          <w:i/>
+          <w:iCs/>
+          <w:sz w:val="22"/>
+          <w:szCs w:val="22"/>
+        </w:rPr>
+        <w:t>,</w:t>
+      </w:r>
+      <w:r>
+        <w:rPr>
+          <w:sz w:val="22"/>
+          <w:szCs w:val="22"/>
+        </w:rPr>
+        <w:t xml:space="preserve"> en esta ruta encontrarás los archivos de conversión </w:t>
+      </w:r>
+      <w:proofErr w:type="gramStart"/>
+      <w:r>
+        <w:rPr>
+          <w:sz w:val="22"/>
+          <w:szCs w:val="22"/>
+        </w:rPr>
+        <w:t>de .</w:t>
+      </w:r>
+      <w:proofErr w:type="spellStart"/>
+      <w:r>
+        <w:rPr>
+          <w:sz w:val="22"/>
+          <w:szCs w:val="22"/>
+        </w:rPr>
+        <w:t>jsonl</w:t>
+      </w:r>
+      <w:proofErr w:type="spellEnd"/>
+      <w:proofErr w:type="gramEnd"/>
+      <w:r>
+        <w:rPr>
+          <w:sz w:val="22"/>
+          <w:szCs w:val="22"/>
+        </w:rPr>
+        <w:t xml:space="preserve"> a .</w:t>
+      </w:r>
+      <w:proofErr w:type="spellStart"/>
+      <w:r>
+        <w:rPr>
+          <w:sz w:val="22"/>
+          <w:szCs w:val="22"/>
+        </w:rPr>
+        <w:t>csv</w:t>
+      </w:r>
+      <w:proofErr w:type="spellEnd"/>
+      <w:r>
+        <w:rPr>
+          <w:sz w:val="22"/>
+          <w:szCs w:val="22"/>
+        </w:rPr>
+        <w:t xml:space="preserve">. Vamos paso a paso a convertir cada uno de los </w:t>
+      </w:r>
+      <w:r>
+        <w:rPr>
+          <w:sz w:val="22"/>
+          <w:szCs w:val="22"/>
+        </w:rPr>
+        <w:t>archivos:</w:t>
+      </w:r>
+    </w:p>
+    <w:p>
+      <w:pPr>
+        <w:jc w:val="both"/>
+        <w:rPr>
+          <w:sz w:val="22"/>
+          <w:szCs w:val="22"/>
+        </w:rPr>
+      </w:pPr>
       <w:r>
         <w:rPr>
           <w:sz w:val="22"/>
           <w:szCs w:val="22"/>
         </w:rPr>
         <w:lastRenderedPageBreak/>
-        <w:t>activando, cambian ligeramente</w:t>
-      </w:r>
-      <w:r>
-        <w:rPr>
-          <w:sz w:val="22"/>
-          <w:szCs w:val="22"/>
-        </w:rPr>
-        <w:t>. Si no te funciona o encuentras algún problema puedes intentar actualizar el comando en el código o ponerte en contacto con alguien que te ayude.</w:t>
-      </w:r>
-    </w:p>
-    <w:p>
-      <w:pPr>
-        <w:pStyle w:val="Ttulo6"/>
-      </w:pPr>
-      <w:r>
-        <w:t>5</w:t>
-      </w:r>
-      <w:r>
-        <w:t xml:space="preserve">.2.2. </w:t>
-      </w:r>
-      <w:r>
-        <w:t>pasar los datos a formato csv</w:t>
-      </w:r>
-    </w:p>
-    <w:p>
-      <w:pPr>
-        <w:jc w:val="both"/>
-        <w:rPr>
-          <w:sz w:val="22"/>
-          <w:szCs w:val="22"/>
-        </w:rPr>
-      </w:pPr>
-      <w:r>
-        <w:rPr>
-          <w:sz w:val="22"/>
-          <w:szCs w:val="22"/>
-        </w:rPr>
-        <w:t xml:space="preserve">Una vez extraídos los </w:t>
-      </w:r>
-      <w:proofErr w:type="gramStart"/>
-      <w:r>
-        <w:rPr>
-          <w:sz w:val="22"/>
-          <w:szCs w:val="22"/>
-        </w:rPr>
-        <w:t>ficheros .</w:t>
-      </w:r>
-      <w:proofErr w:type="spellStart"/>
-      <w:r>
-        <w:rPr>
-          <w:sz w:val="22"/>
-          <w:szCs w:val="22"/>
-        </w:rPr>
-        <w:t>jsonl</w:t>
-      </w:r>
-      <w:proofErr w:type="spellEnd"/>
-      <w:proofErr w:type="gramEnd"/>
-      <w:r>
-        <w:rPr>
-          <w:sz w:val="22"/>
-          <w:szCs w:val="22"/>
-        </w:rPr>
-        <w:t xml:space="preserve">, </w:t>
-      </w:r>
-      <w:r>
-        <w:rPr>
-          <w:sz w:val="22"/>
-          <w:szCs w:val="22"/>
-        </w:rPr>
-        <w:t>toca convertirlos a .</w:t>
-      </w:r>
-      <w:proofErr w:type="spellStart"/>
-      <w:r>
-        <w:rPr>
-          <w:sz w:val="22"/>
-          <w:szCs w:val="22"/>
-        </w:rPr>
-        <w:t>csv</w:t>
-      </w:r>
-      <w:proofErr w:type="spellEnd"/>
-      <w:r>
-        <w:rPr>
-          <w:sz w:val="22"/>
-          <w:szCs w:val="22"/>
-        </w:rPr>
-        <w:t xml:space="preserve">. Para ello </w:t>
-      </w:r>
-      <w:r>
-        <w:rPr>
-          <w:sz w:val="22"/>
-          <w:szCs w:val="22"/>
-        </w:rPr>
-        <w:t xml:space="preserve">seguiremos los siguientes pasos. Debemos acceder a </w:t>
-      </w:r>
-      <w:r>
-        <w:rPr>
-          <w:i/>
-          <w:iCs/>
-          <w:sz w:val="22"/>
-          <w:szCs w:val="22"/>
-        </w:rPr>
-        <w:t>data/</w:t>
-      </w:r>
-      <w:proofErr w:type="spellStart"/>
-      <w:r>
-        <w:rPr>
-          <w:i/>
-          <w:iCs/>
-          <w:sz w:val="22"/>
-          <w:szCs w:val="22"/>
-        </w:rPr>
-        <w:t>saveCSV</w:t>
-      </w:r>
-      <w:proofErr w:type="spellEnd"/>
-      <w:r>
-        <w:rPr>
-          <w:i/>
-          <w:iCs/>
-          <w:sz w:val="22"/>
-          <w:szCs w:val="22"/>
-        </w:rPr>
-        <w:t>/</w:t>
-      </w:r>
-      <w:r>
-        <w:rPr>
-          <w:i/>
-          <w:iCs/>
-          <w:sz w:val="22"/>
-          <w:szCs w:val="22"/>
-        </w:rPr>
-        <w:t>,</w:t>
-      </w:r>
-      <w:r>
-        <w:rPr>
-          <w:sz w:val="22"/>
-          <w:szCs w:val="22"/>
-        </w:rPr>
-        <w:t xml:space="preserve"> en esta ruta encontrarás los archivos de conversión </w:t>
-      </w:r>
-      <w:proofErr w:type="gramStart"/>
-      <w:r>
-        <w:rPr>
-          <w:sz w:val="22"/>
-          <w:szCs w:val="22"/>
-        </w:rPr>
-        <w:t>de .</w:t>
-      </w:r>
-      <w:proofErr w:type="spellStart"/>
-      <w:r>
-        <w:rPr>
-          <w:sz w:val="22"/>
-          <w:szCs w:val="22"/>
-        </w:rPr>
-        <w:t>jsonl</w:t>
-      </w:r>
-      <w:proofErr w:type="spellEnd"/>
-      <w:proofErr w:type="gramEnd"/>
-      <w:r>
-        <w:rPr>
-          <w:sz w:val="22"/>
-          <w:szCs w:val="22"/>
-        </w:rPr>
-        <w:t xml:space="preserve"> a .</w:t>
-      </w:r>
-      <w:proofErr w:type="spellStart"/>
-      <w:r>
-        <w:rPr>
-          <w:sz w:val="22"/>
-          <w:szCs w:val="22"/>
-        </w:rPr>
-        <w:t>csv</w:t>
-      </w:r>
-      <w:proofErr w:type="spellEnd"/>
-      <w:r>
-        <w:rPr>
-          <w:sz w:val="22"/>
-          <w:szCs w:val="22"/>
-        </w:rPr>
-        <w:t xml:space="preserve">. Vamos paso a paso a convertir cada uno de los </w:t>
-      </w:r>
-      <w:r>
-        <w:rPr>
-          <w:sz w:val="22"/>
-          <w:szCs w:val="22"/>
-        </w:rPr>
-        <w:t>archivos:</w:t>
-      </w:r>
-    </w:p>
-    <w:p>
-      <w:pPr>
-        <w:jc w:val="both"/>
-        <w:rPr>
-          <w:sz w:val="22"/>
-          <w:szCs w:val="22"/>
-        </w:rPr>
-      </w:pPr>
-      <w:r>
-        <w:rPr>
-          <w:sz w:val="22"/>
-          <w:szCs w:val="22"/>
-        </w:rPr>
         <w:t xml:space="preserve">Lo primero que vamos a hacer es abrir el archivo </w:t>
       </w:r>
       <w:r>
@@ -9963,7 +10313,7 @@
                     <pic:cNvPicPr/>
                   </pic:nvPicPr>
                   <pic:blipFill rotWithShape="1">
-                    <a:blip r:embed="rId25"/>
+                    <a:blip r:embed="rId29"/>
                     <a:srcRect l="19932"/>
                     <a:stretch>
                       <a:fillRect/>
@@ -10039,7 +10389,7 @@
                     <pic:cNvPicPr/>
                   </pic:nvPicPr>
                   <pic:blipFill>
-                    <a:blip r:embed="rId26"/>
+                    <a:blip r:embed="rId30"/>
                     <a:stretch>
                       <a:fillRect/>
                     </a:stretch>
@@ -10197,7 +10547,7 @@
                     <pic:cNvPicPr/>
                   </pic:nvPicPr>
                   <pic:blipFill>
-                    <a:blip r:embed="rId27"/>
+                    <a:blip r:embed="rId31"/>
                     <a:stretch>
                       <a:fillRect/>
                     </a:stretch>
@@ -10231,96 +10581,96 @@
           <w:sz w:val="22"/>
           <w:szCs w:val="22"/>
         </w:rPr>
+        <w:t xml:space="preserve">A partir de aquí podemos continuar con el archivo </w:t>
+      </w:r>
+      <w:r>
+        <w:rPr>
+          <w:i/>
+          <w:iCs/>
+          <w:sz w:val="22"/>
+          <w:szCs w:val="22"/>
+        </w:rPr>
+        <w:t>data/</w:t>
+      </w:r>
+      <w:proofErr w:type="spellStart"/>
+      <w:r>
+        <w:rPr>
+          <w:i/>
+          <w:iCs/>
+          <w:sz w:val="22"/>
+          <w:szCs w:val="22"/>
+        </w:rPr>
+        <w:t>saveCSV</w:t>
+      </w:r>
+      <w:proofErr w:type="spellEnd"/>
+      <w:r>
+        <w:rPr>
+          <w:i/>
+          <w:iCs/>
+          <w:sz w:val="22"/>
+          <w:szCs w:val="22"/>
+        </w:rPr>
+        <w:t>/save_</w:t>
+      </w:r>
+      <w:r>
+        <w:rPr>
+          <w:i/>
+          <w:iCs/>
+          <w:sz w:val="22"/>
+          <w:szCs w:val="22"/>
+        </w:rPr>
+        <w:t>publication</w:t>
+      </w:r>
+      <w:r>
+        <w:rPr>
+          <w:i/>
+          <w:iCs/>
+          <w:sz w:val="22"/>
+          <w:szCs w:val="22"/>
+        </w:rPr>
+        <w:t>s_csv.py</w:t>
+      </w:r>
+      <w:r>
+        <w:rPr>
+          <w:i/>
+          <w:iCs/>
+          <w:sz w:val="22"/>
+          <w:szCs w:val="22"/>
+        </w:rPr>
+        <w:t>.</w:t>
+      </w:r>
+      <w:r>
+        <w:rPr>
+          <w:i/>
+          <w:iCs/>
+          <w:sz w:val="22"/>
+          <w:szCs w:val="22"/>
+        </w:rPr>
+        <w:t xml:space="preserve"> </w:t>
+      </w:r>
+      <w:r>
+        <w:rPr>
+          <w:sz w:val="22"/>
+          <w:szCs w:val="22"/>
+        </w:rPr>
+        <w:t>Al ejecutar debemos tener lo siguiente:</w:t>
+      </w:r>
+    </w:p>
+    <w:p>
+      <w:pPr>
+        <w:jc w:val="center"/>
+        <w:rPr>
+          <w:sz w:val="22"/>
+          <w:szCs w:val="22"/>
+        </w:rPr>
+      </w:pPr>
+      <w:r>
+        <w:rPr>
+          <w:noProof/>
+          <w:sz w:val="22"/>
+          <w:szCs w:val="22"/>
+        </w:rPr>
         <w:lastRenderedPageBreak/>
-        <w:t xml:space="preserve">A partir de aquí podemos continuar con el archivo </w:t>
-      </w:r>
-      <w:r>
-        <w:rPr>
-          <w:i/>
-          <w:iCs/>
-          <w:sz w:val="22"/>
-          <w:szCs w:val="22"/>
-        </w:rPr>
-        <w:t>data/</w:t>
-      </w:r>
-      <w:proofErr w:type="spellStart"/>
-      <w:r>
-        <w:rPr>
-          <w:i/>
-          <w:iCs/>
-          <w:sz w:val="22"/>
-          <w:szCs w:val="22"/>
-        </w:rPr>
-        <w:t>saveCSV</w:t>
-      </w:r>
-      <w:proofErr w:type="spellEnd"/>
-      <w:r>
-        <w:rPr>
-          <w:i/>
-          <w:iCs/>
-          <w:sz w:val="22"/>
-          <w:szCs w:val="22"/>
-        </w:rPr>
-        <w:t>/save_</w:t>
-      </w:r>
-      <w:r>
-        <w:rPr>
-          <w:i/>
-          <w:iCs/>
-          <w:sz w:val="22"/>
-          <w:szCs w:val="22"/>
-        </w:rPr>
-        <w:t>publication</w:t>
-      </w:r>
-      <w:r>
-        <w:rPr>
-          <w:i/>
-          <w:iCs/>
-          <w:sz w:val="22"/>
-          <w:szCs w:val="22"/>
-        </w:rPr>
-        <w:t>s_csv.py</w:t>
-      </w:r>
-      <w:r>
-        <w:rPr>
-          <w:i/>
-          <w:iCs/>
-          <w:sz w:val="22"/>
-          <w:szCs w:val="22"/>
-        </w:rPr>
-        <w:t>.</w:t>
-      </w:r>
-      <w:r>
-        <w:rPr>
-          <w:i/>
-          <w:iCs/>
-          <w:sz w:val="22"/>
-          <w:szCs w:val="22"/>
-        </w:rPr>
-        <w:t xml:space="preserve"> </w:t>
-      </w:r>
-      <w:r>
-        <w:rPr>
-          <w:sz w:val="22"/>
-          <w:szCs w:val="22"/>
-        </w:rPr>
-        <w:t>Al ejecutar debemos tener lo siguiente:</w:t>
-      </w:r>
-    </w:p>
-    <w:p>
-      <w:pPr>
-        <w:jc w:val="center"/>
-        <w:rPr>
-          <w:sz w:val="22"/>
-          <w:szCs w:val="22"/>
-        </w:rPr>
-      </w:pPr>
-      <w:r>
-        <w:rPr>
-          <w:noProof/>
-          <w:sz w:val="22"/>
-          <w:szCs w:val="22"/>
-        </w:rPr>
         <w:drawing>
           <wp:inline distT="0" distB="0" distL="0" distR="0" wp14:anchorId="5CF1A5BA" wp14:editId="2A5930F3">
             <wp:extent cx="2819400" cy="1860385"/>
@@ -10337,7 +10687,7 @@
                     <pic:cNvPicPr/>
                   </pic:nvPicPr>
                   <pic:blipFill>
-                    <a:blip r:embed="rId28"/>
+                    <a:blip r:embed="rId32"/>
                     <a:stretch>
                       <a:fillRect/>
                     </a:stretch>
@@ -10483,7 +10833,7 @@
                     <pic:cNvPicPr/>
                   </pic:nvPicPr>
                   <pic:blipFill>
-                    <a:blip r:embed="rId29"/>
+                    <a:blip r:embed="rId33"/>
                     <a:stretch>
                       <a:fillRect/>
                     </a:stretch>
@@ -10575,7 +10925,7 @@
                     <pic:cNvPicPr/>
                   </pic:nvPicPr>
                   <pic:blipFill>
-                    <a:blip r:embed="rId30"/>
+                    <a:blip r:embed="rId34"/>
                     <a:stretch>
                       <a:fillRect/>
                     </a:stretch>
@@ -10643,7 +10993,7 @@
                     <pic:cNvPicPr/>
                   </pic:nvPicPr>
                   <pic:blipFill>
-                    <a:blip r:embed="rId31"/>
+                    <a:blip r:embed="rId35"/>
                     <a:stretch>
                       <a:fillRect/>
                     </a:stretch>
@@ -10930,7 +11280,7 @@
                     <pic:cNvPicPr/>
                   </pic:nvPicPr>
                   <pic:blipFill>
-                    <a:blip r:embed="rId32"/>
+                    <a:blip r:embed="rId36"/>
                     <a:stretch>
                       <a:fillRect/>
                     </a:stretch>
@@ -11011,7 +11361,7 @@
                     <pic:cNvPicPr/>
                   </pic:nvPicPr>
                   <pic:blipFill>
-                    <a:blip r:embed="rId33"/>
+                    <a:blip r:embed="rId37"/>
                     <a:stretch>
                       <a:fillRect/>
                     </a:stretch>
@@ -11144,7 +11494,7 @@
                     <pic:cNvPicPr/>
                   </pic:nvPicPr>
                   <pic:blipFill>
-                    <a:blip r:embed="rId34"/>
+                    <a:blip r:embed="rId38"/>
                     <a:stretch>
                       <a:fillRect/>
                     </a:stretch>
@@ -11247,7 +11597,7 @@
                     <pic:cNvPicPr/>
                   </pic:nvPicPr>
                   <pic:blipFill>
-                    <a:blip r:embed="rId35"/>
+                    <a:blip r:embed="rId39"/>
                     <a:stretch>
                       <a:fillRect/>
                     </a:stretch>
@@ -11321,7 +11671,7 @@
                     <pic:cNvPicPr/>
                   </pic:nvPicPr>
                   <pic:blipFill>
-                    <a:blip r:embed="rId36"/>
+                    <a:blip r:embed="rId40"/>
                     <a:stretch>
                       <a:fillRect/>
                     </a:stretch>
@@ -11360,9 +11710,28 @@
     </w:p>
     <w:p>
       <w:pPr>
+        <w:jc w:val="both"/>
+        <w:rPr>
+          <w:sz w:val="22"/>
+          <w:szCs w:val="22"/>
+        </w:rPr>
+      </w:pPr>
+    </w:p>
+    <w:p>
+      <w:pPr>
+        <w:jc w:val="both"/>
+        <w:rPr>
+          <w:sz w:val="22"/>
+          <w:szCs w:val="22"/>
+        </w:rPr>
+      </w:pPr>
+    </w:p>
+    <w:p>
+      <w:pPr>
         <w:pStyle w:val="Ttulo6"/>
       </w:pPr>
       <w:r>
+        <w:lastRenderedPageBreak/>
         <w:t>5</w:t>
       </w:r>
       <w:r>
@@ -11397,7 +11766,6 @@
           <w:sz w:val="22"/>
           <w:szCs w:val="22"/>
         </w:rPr>
-        <w:lastRenderedPageBreak/>
         <w:t xml:space="preserve">Una vez hemos llegado a este punto, podemos cargar </w:t>
       </w:r>
       <w:r>
@@ -11630,7 +11998,7 @@
                     <pic:cNvPicPr/>
                   </pic:nvPicPr>
                   <pic:blipFill>
-                    <a:blip r:embed="rId37"/>
+                    <a:blip r:embed="rId41"/>
                     <a:stretch>
                       <a:fillRect/>
                     </a:stretch>
@@ -11864,7 +12232,7 @@
                     <pic:cNvPicPr/>
                   </pic:nvPicPr>
                   <pic:blipFill>
-                    <a:blip r:embed="rId38"/>
+                    <a:blip r:embed="rId42"/>
                     <a:stretch>
                       <a:fillRect/>
                     </a:stretch>
@@ -12024,7 +12392,7 @@
                     <pic:cNvPicPr/>
                   </pic:nvPicPr>
                   <pic:blipFill>
-                    <a:blip r:embed="rId39"/>
+                    <a:blip r:embed="rId43"/>
                     <a:stretch>
                       <a:fillRect/>
                     </a:stretch>
@@ -12135,9 +12503,19 @@
     </w:p>
     <w:p>
       <w:pPr>
+        <w:jc w:val="both"/>
+        <w:rPr>
+          <w:sz w:val="22"/>
+          <w:szCs w:val="22"/>
+        </w:rPr>
+      </w:pPr>
+    </w:p>
+    <w:p>
+      <w:pPr>
         <w:pStyle w:val="Ttulo6"/>
       </w:pPr>
       <w:r>
+        <w:lastRenderedPageBreak/>
         <w:t>5</w:t>
       </w:r>
       <w:r>
@@ -12172,7 +12550,6 @@
           <w:sz w:val="22"/>
           <w:szCs w:val="22"/>
         </w:rPr>
-        <w:lastRenderedPageBreak/>
         <w:t>Este proceso es largo y, consiste en preparar todas las redes de colaboración que se van a ver en la sección correspondiente de la web. Se montan las redes (nodos y enlaces), y se ejecutan todos los algoritmos de clustering y detección de comunidades. El proceso es el siguiente:</w:t>
       </w:r>
     </w:p>
@@ -12335,7 +12712,7 @@
                     <pic:cNvPicPr/>
                   </pic:nvPicPr>
                   <pic:blipFill>
-                    <a:blip r:embed="rId40"/>
+                    <a:blip r:embed="rId44"/>
                     <a:stretch>
                       <a:fillRect/>
                     </a:stretch>
@@ -12613,7 +12990,7 @@
                     <pic:cNvPicPr/>
                   </pic:nvPicPr>
                   <pic:blipFill>
-                    <a:blip r:embed="rId41"/>
+                    <a:blip r:embed="rId45"/>
                     <a:stretch>
                       <a:fillRect/>
                     </a:stretch>
@@ -12759,7 +13136,7 @@
                     <pic:cNvPicPr/>
                   </pic:nvPicPr>
                   <pic:blipFill>
-                    <a:blip r:embed="rId42"/>
+                    <a:blip r:embed="rId46"/>
                     <a:stretch>
                       <a:fillRect/>
                     </a:stretch>
@@ -12925,7 +13302,7 @@
                     <pic:cNvPicPr/>
                   </pic:nvPicPr>
                   <pic:blipFill>
-                    <a:blip r:embed="rId43"/>
+                    <a:blip r:embed="rId47"/>
                     <a:stretch>
                       <a:fillRect/>
                     </a:stretch>
@@ -12976,7 +13353,7 @@
                     <pic:cNvPicPr/>
                   </pic:nvPicPr>
                   <pic:blipFill>
-                    <a:blip r:embed="rId44"/>
+                    <a:blip r:embed="rId48"/>
                     <a:stretch>
                       <a:fillRect/>
                     </a:stretch>
@@ -13212,7 +13589,7 @@
                     <pic:cNvPicPr/>
                   </pic:nvPicPr>
                   <pic:blipFill>
-                    <a:blip r:embed="rId45"/>
+                    <a:blip r:embed="rId49"/>
                     <a:stretch>
                       <a:fillRect/>
                     </a:stretch>
@@ -13658,6 +14035,7 @@
       </w:pPr>
       <w:r>
         <w:rPr>
+          <w:noProof/>
           <w:sz w:val="22"/>
           <w:szCs w:val="22"/>
         </w:rPr>
@@ -13677,7 +14055,7 @@
                     <pic:cNvPicPr/>
                   </pic:nvPicPr>
                   <pic:blipFill>
-                    <a:blip r:embed="rId46"/>
+                    <a:blip r:embed="rId50"/>
                     <a:stretch>
                       <a:fillRect/>
                     </a:stretch>
@@ -14586,7 +14964,7 @@
                     <pic:cNvPicPr/>
                   </pic:nvPicPr>
                   <pic:blipFill>
-                    <a:blip r:embed="rId47"/>
+                    <a:blip r:embed="rId51"/>
                     <a:stretch>
                       <a:fillRect/>
                     </a:stretch>
@@ -15639,7 +16017,7 @@
                     <pic:cNvPicPr/>
                   </pic:nvPicPr>
                   <pic:blipFill>
-                    <a:blip r:embed="rId48"/>
+                    <a:blip r:embed="rId52"/>
                     <a:stretch>
                       <a:fillRect/>
                     </a:stretch>
@@ -15907,7 +16285,7 @@
                     <pic:cNvPicPr/>
                   </pic:nvPicPr>
                   <pic:blipFill>
-                    <a:blip r:embed="rId49"/>
+                    <a:blip r:embed="rId53"/>
                     <a:stretch>
                       <a:fillRect/>
                     </a:stretch>
@@ -15959,7 +16337,7 @@
                     <pic:cNvPicPr/>
                   </pic:nvPicPr>
                   <pic:blipFill>
-                    <a:blip r:embed="rId50"/>
+                    <a:blip r:embed="rId54"/>
                     <a:stretch>
                       <a:fillRect/>
                     </a:stretch>
@@ -16010,7 +16388,7 @@
                     <pic:cNvPicPr/>
                   </pic:nvPicPr>
                   <pic:blipFill>
-                    <a:blip r:embed="rId51"/>
+                    <a:blip r:embed="rId55"/>
                     <a:stretch>
                       <a:fillRect/>
                     </a:stretch>
@@ -16061,7 +16439,7 @@
                     <pic:cNvPicPr/>
                   </pic:nvPicPr>
                   <pic:blipFill>
-                    <a:blip r:embed="rId52"/>
+                    <a:blip r:embed="rId56"/>
                     <a:stretch>
                       <a:fillRect/>
                     </a:stretch>
@@ -16112,7 +16490,7 @@
                     <pic:cNvPicPr/>
                   </pic:nvPicPr>
                   <pic:blipFill>
-                    <a:blip r:embed="rId53"/>
+                    <a:blip r:embed="rId57"/>
                     <a:stretch>
                       <a:fillRect/>
                     </a:stretch>
@@ -16253,7 +16631,7 @@
                     <pic:cNvPicPr/>
                   </pic:nvPicPr>
                   <pic:blipFill>
-                    <a:blip r:embed="rId54"/>
+                    <a:blip r:embed="rId58"/>
                     <a:stretch>
                       <a:fillRect/>
                     </a:stretch>
@@ -16445,7 +16823,7 @@
                     <pic:cNvPicPr/>
                   </pic:nvPicPr>
                   <pic:blipFill>
-                    <a:blip r:embed="rId55"/>
+                    <a:blip r:embed="rId59"/>
                     <a:stretch>
                       <a:fillRect/>
                     </a:stretch>
@@ -16692,7 +17070,7 @@
                     <pic:cNvPicPr/>
                   </pic:nvPicPr>
                   <pic:blipFill>
-                    <a:blip r:embed="rId56"/>
+                    <a:blip r:embed="rId60"/>
                     <a:stretch>
                       <a:fillRect/>
                     </a:stretch>
@@ -16845,7 +17223,7 @@
                     <pic:cNvPicPr/>
                   </pic:nvPicPr>
                   <pic:blipFill>
-                    <a:blip r:embed="rId57"/>
+                    <a:blip r:embed="rId61"/>
                     <a:stretch>
                       <a:fillRect/>
                     </a:stretch>
@@ -16950,7 +17328,7 @@
                     <pic:cNvPicPr/>
                   </pic:nvPicPr>
                   <pic:blipFill>
-                    <a:blip r:embed="rId58"/>
+                    <a:blip r:embed="rId62"/>
                     <a:stretch>
                       <a:fillRect/>
                     </a:stretch>
@@ -17040,7 +17418,7 @@
                     <pic:cNvPicPr/>
                   </pic:nvPicPr>
                   <pic:blipFill>
-                    <a:blip r:embed="rId59"/>
+                    <a:blip r:embed="rId63"/>
                     <a:stretch>
                       <a:fillRect/>
                     </a:stretch>
@@ -17135,7 +17513,7 @@
                     <pic:cNvPicPr/>
                   </pic:nvPicPr>
                   <pic:blipFill>
-                    <a:blip r:embed="rId60"/>
+                    <a:blip r:embed="rId64"/>
                     <a:stretch>
                       <a:fillRect/>
                     </a:stretch>
@@ -17357,7 +17735,7 @@
                     <pic:cNvPicPr/>
                   </pic:nvPicPr>
                   <pic:blipFill>
-                    <a:blip r:embed="rId61"/>
+                    <a:blip r:embed="rId65"/>
                     <a:stretch>
                       <a:fillRect/>
                     </a:stretch>
@@ -17530,7 +17908,7 @@
                     <pic:cNvPicPr/>
                   </pic:nvPicPr>
                   <pic:blipFill rotWithShape="1">
-                    <a:blip r:embed="rId62"/>
+                    <a:blip r:embed="rId66"/>
                     <a:srcRect t="29546"/>
                     <a:stretch>
                       <a:fillRect/>
@@ -17670,8 +18048,20 @@
           <w:szCs w:val="22"/>
           <w:lang w:val="en-GB"/>
         </w:rPr>
-        <w:t>python manage.py build_hnsw_index.py</w:t>
-      </w:r>
+        <w:t xml:space="preserve">python manage.py </w:t>
+      </w:r>
+      <w:proofErr w:type="spellStart"/>
+      <w:r>
+        <w:rPr>
+          <w:i/>
+          <w:iCs/>
+          <w:sz w:val="22"/>
+          <w:szCs w:val="22"/>
+          <w:lang w:val="en-GB"/>
+        </w:rPr>
+        <w:t>build_hnsw_index</w:t>
+      </w:r>
+      <w:proofErr w:type="spellEnd"/>
     </w:p>
     <w:p>
       <w:pPr>
@@ -17805,7 +18195,7 @@
                     <pic:cNvPicPr/>
                   </pic:nvPicPr>
                   <pic:blipFill>
-                    <a:blip r:embed="rId63"/>
+                    <a:blip r:embed="rId67"/>
                     <a:stretch>
                       <a:fillRect/>
                     </a:stretch>
@@ -18133,7 +18523,7 @@
         </w:rPr>
         <w:t xml:space="preserve"> </w:t>
       </w:r>
-      <w:hyperlink r:id="rId64" w:history="1">
+      <w:hyperlink r:id="rId68" w:history="1">
         <w:r>
           <w:rPr>
             <w:rStyle w:val="Hipervnculo"/>
@@ -18244,7 +18634,7 @@
                     <pic:cNvPicPr/>
                   </pic:nvPicPr>
                   <pic:blipFill>
-                    <a:blip r:embed="rId65"/>
+                    <a:blip r:embed="rId69"/>
                     <a:stretch>
                       <a:fillRect/>
                     </a:stretch>
@@ -18853,7 +19243,301 @@
           <w:sz w:val="22"/>
           <w:szCs w:val="22"/>
         </w:rPr>
-        <w:t xml:space="preserve"> en el que se hace la actualización para no perder nada </w:t>
+        <w:t xml:space="preserve"> en el que se hace la actualización para no perder nada y siempre poder volver</w:t>
+      </w:r>
+      <w:r>
+        <w:rPr>
+          <w:sz w:val="22"/>
+          <w:szCs w:val="22"/>
+        </w:rPr>
+        <w:t>, además sirve para saber cuándo fue la última vez que se actualizó la aplicación</w:t>
+      </w:r>
+      <w:r>
+        <w:rPr>
+          <w:sz w:val="22"/>
+          <w:szCs w:val="22"/>
+        </w:rPr>
+        <w:t>.</w:t>
+      </w:r>
+      <w:r>
+        <w:rPr>
+          <w:sz w:val="22"/>
+          <w:szCs w:val="22"/>
+        </w:rPr>
+        <w:t xml:space="preserve"> Queda de esta manera, siendo Bibliometria.zip la nueva versión y la que tiene fecha la anterior:</w:t>
+      </w:r>
+    </w:p>
+    <w:p>
+      <w:pPr>
+        <w:jc w:val="both"/>
+        <w:rPr>
+          <w:sz w:val="22"/>
+          <w:szCs w:val="22"/>
+        </w:rPr>
+      </w:pPr>
+      <w:r>
+        <w:rPr>
+          <w:noProof/>
+          <w:sz w:val="22"/>
+          <w:szCs w:val="22"/>
+        </w:rPr>
+        <w:lastRenderedPageBreak/>
+        <w:drawing>
+          <wp:inline distT="0" distB="0" distL="0" distR="0" wp14:anchorId="704DF5A6" wp14:editId="3067C931">
+            <wp:extent cx="5400040" cy="552450"/>
+            <wp:effectExtent l="0" t="0" r="0" b="0"/>
+            <wp:docPr id="1391930473" name="Imagen 1" descr="Rectángulo&#10;&#10;El contenido generado por IA puede ser incorrecto."/>
+            <wp:cNvGraphicFramePr>
+              <a:graphicFrameLocks xmlns:a="http://schemas.openxmlformats.org/drawingml/2006/main" noChangeAspect="1"/>
+            </wp:cNvGraphicFramePr>
+            <a:graphic xmlns:a="http://schemas.openxmlformats.org/drawingml/2006/main">
+              <a:graphicData uri="http://schemas.openxmlformats.org/drawingml/2006/picture">
+                <pic:pic xmlns:pic="http://schemas.openxmlformats.org/drawingml/2006/picture">
+                  <pic:nvPicPr>
+                    <pic:cNvPr id="1391930473" name="Imagen 1" descr="Rectángulo&#10;&#10;El contenido generado por IA puede ser incorrecto."/>
+                    <pic:cNvPicPr/>
+                  </pic:nvPicPr>
+                  <pic:blipFill>
+                    <a:blip r:embed="rId70"/>
+                    <a:stretch>
+                      <a:fillRect/>
+                    </a:stretch>
+                  </pic:blipFill>
+                  <pic:spPr>
+                    <a:xfrm>
+                      <a:off x="0" y="0"/>
+                      <a:ext cx="5400040" cy="552450"/>
+                    </a:xfrm>
+                    <a:prstGeom prst="rect">
+                      <a:avLst/>
+                    </a:prstGeom>
+                  </pic:spPr>
+                </pic:pic>
+              </a:graphicData>
+            </a:graphic>
+          </wp:inline>
+        </w:drawing>
+      </w:r>
+    </w:p>
+    <w:p>
+      <w:pPr>
+        <w:jc w:val="both"/>
+        <w:rPr>
+          <w:i/>
+          <w:iCs/>
+          <w:sz w:val="22"/>
+          <w:szCs w:val="22"/>
+        </w:rPr>
+      </w:pPr>
+      <w:r>
+        <w:rPr>
+          <w:sz w:val="22"/>
+          <w:szCs w:val="22"/>
+        </w:rPr>
+        <w:t xml:space="preserve">IMPORTANTE: Si has cambiado las guías dentro de la carpeta </w:t>
+      </w:r>
+      <w:r>
+        <w:rPr>
+          <w:i/>
+          <w:iCs/>
+          <w:sz w:val="22"/>
+          <w:szCs w:val="22"/>
+        </w:rPr>
+        <w:t xml:space="preserve">Guias </w:t>
+      </w:r>
+      <w:proofErr w:type="spellStart"/>
+      <w:r>
+        <w:rPr>
+          <w:i/>
+          <w:iCs/>
+          <w:sz w:val="22"/>
+          <w:szCs w:val="22"/>
+        </w:rPr>
+        <w:t>BibliometriaIPBLN</w:t>
+      </w:r>
+      <w:proofErr w:type="spellEnd"/>
+      <w:r>
+        <w:rPr>
+          <w:sz w:val="22"/>
+          <w:szCs w:val="22"/>
+        </w:rPr>
+        <w:t xml:space="preserve">, deberás incluir una copia con los nuevos cambios en dichas </w:t>
+      </w:r>
+      <w:proofErr w:type="spellStart"/>
+      <w:r>
+        <w:rPr>
+          <w:sz w:val="22"/>
+          <w:szCs w:val="22"/>
+        </w:rPr>
+        <w:t>guias</w:t>
+      </w:r>
+      <w:proofErr w:type="spellEnd"/>
+      <w:r>
+        <w:rPr>
+          <w:sz w:val="22"/>
+          <w:szCs w:val="22"/>
+        </w:rPr>
+        <w:t xml:space="preserve"> tanto en la carpeta </w:t>
+      </w:r>
+      <w:proofErr w:type="spellStart"/>
+      <w:r>
+        <w:rPr>
+          <w:i/>
+          <w:iCs/>
+          <w:sz w:val="22"/>
+          <w:szCs w:val="22"/>
+        </w:rPr>
+        <w:t>static</w:t>
+      </w:r>
+      <w:proofErr w:type="spellEnd"/>
+      <w:r>
+        <w:rPr>
+          <w:i/>
+          <w:iCs/>
+          <w:sz w:val="22"/>
+          <w:szCs w:val="22"/>
+        </w:rPr>
+        <w:t>/</w:t>
+      </w:r>
+      <w:proofErr w:type="spellStart"/>
+      <w:r>
+        <w:rPr>
+          <w:i/>
+          <w:iCs/>
+          <w:sz w:val="22"/>
+          <w:szCs w:val="22"/>
+        </w:rPr>
+        <w:t>docs</w:t>
+      </w:r>
+      <w:proofErr w:type="spellEnd"/>
+      <w:r>
+        <w:rPr>
+          <w:i/>
+          <w:iCs/>
+          <w:sz w:val="22"/>
+          <w:szCs w:val="22"/>
+        </w:rPr>
+        <w:t>/</w:t>
+      </w:r>
+      <w:r>
+        <w:rPr>
+          <w:sz w:val="22"/>
+          <w:szCs w:val="22"/>
+        </w:rPr>
+        <w:t xml:space="preserve"> como en la carpeta </w:t>
+      </w:r>
+      <w:proofErr w:type="spellStart"/>
+      <w:r>
+        <w:rPr>
+          <w:i/>
+          <w:iCs/>
+          <w:sz w:val="22"/>
+          <w:szCs w:val="22"/>
+        </w:rPr>
+        <w:t>staticfiles</w:t>
+      </w:r>
+      <w:proofErr w:type="spellEnd"/>
+      <w:r>
+        <w:rPr>
+          <w:i/>
+          <w:iCs/>
+          <w:sz w:val="22"/>
+          <w:szCs w:val="22"/>
+        </w:rPr>
+        <w:t>/</w:t>
+      </w:r>
+      <w:proofErr w:type="spellStart"/>
+      <w:r>
+        <w:rPr>
+          <w:i/>
+          <w:iCs/>
+          <w:sz w:val="22"/>
+          <w:szCs w:val="22"/>
+        </w:rPr>
+        <w:t>docs</w:t>
+      </w:r>
+      <w:proofErr w:type="spellEnd"/>
+      <w:r>
+        <w:rPr>
+          <w:i/>
+          <w:iCs/>
+          <w:sz w:val="22"/>
+          <w:szCs w:val="22"/>
+        </w:rPr>
+        <w:t>/</w:t>
+      </w:r>
+      <w:r>
+        <w:rPr>
+          <w:sz w:val="22"/>
+          <w:szCs w:val="22"/>
+        </w:rPr>
+        <w:t xml:space="preserve"> y renombrando los archivos .</w:t>
+      </w:r>
+      <w:proofErr w:type="spellStart"/>
+      <w:r>
+        <w:rPr>
+          <w:sz w:val="22"/>
+          <w:szCs w:val="22"/>
+        </w:rPr>
+        <w:t>pdf</w:t>
+      </w:r>
+      <w:proofErr w:type="spellEnd"/>
+      <w:r>
+        <w:rPr>
+          <w:sz w:val="22"/>
+          <w:szCs w:val="22"/>
+        </w:rPr>
+        <w:t xml:space="preserve"> a </w:t>
+      </w:r>
+      <w:r>
+        <w:rPr>
+          <w:i/>
+          <w:iCs/>
+          <w:sz w:val="22"/>
+          <w:szCs w:val="22"/>
+        </w:rPr>
+        <w:t>user_guide.pdf y technical_guide.pdf</w:t>
+      </w:r>
+      <w:r>
+        <w:rPr>
+          <w:i/>
+          <w:iCs/>
+          <w:sz w:val="22"/>
+          <w:szCs w:val="22"/>
+        </w:rPr>
+        <w:t>.</w:t>
+      </w:r>
+    </w:p>
+    <w:p>
+      <w:pPr>
+        <w:jc w:val="both"/>
+        <w:rPr>
+          <w:sz w:val="22"/>
+          <w:szCs w:val="22"/>
+        </w:rPr>
+      </w:pPr>
+      <w:r>
+        <w:rPr>
+          <w:sz w:val="22"/>
+          <w:szCs w:val="22"/>
+        </w:rPr>
+        <w:t xml:space="preserve">El siguiente paso es acceder </w:t>
+      </w:r>
+      <w:proofErr w:type="spellStart"/>
+      <w:r>
+        <w:rPr>
+          <w:sz w:val="22"/>
+          <w:szCs w:val="22"/>
+        </w:rPr>
+        <w:t>Hansolo</w:t>
+      </w:r>
+      <w:proofErr w:type="spellEnd"/>
+      <w:r>
+        <w:rPr>
+          <w:sz w:val="22"/>
+          <w:szCs w:val="22"/>
+        </w:rPr>
+        <w:t xml:space="preserve"> para eliminar o mover la versión antigua de la aplicación y así poder actualizar con </w:t>
       </w:r>
       <w:proofErr w:type="gramStart"/>
       <w:r>
@@ -18861,7 +19545,7 @@
           <w:sz w:val="22"/>
           <w:szCs w:val="22"/>
         </w:rPr>
-        <w:t>y  siempre</w:t>
+        <w:t>nuestra  nueva</w:t>
       </w:r>
       <w:proofErr w:type="gramEnd"/>
       <w:r>
@@ -18869,63 +19553,7 @@
           <w:sz w:val="22"/>
           <w:szCs w:val="22"/>
         </w:rPr>
-        <w:t xml:space="preserve"> poder volver.</w:t>
-      </w:r>
-    </w:p>
-    <w:p>
-      <w:pPr>
-        <w:jc w:val="both"/>
-        <w:rPr>
-          <w:sz w:val="22"/>
-          <w:szCs w:val="22"/>
-        </w:rPr>
-      </w:pPr>
-      <w:r>
-        <w:rPr>
-          <w:sz w:val="22"/>
-          <w:szCs w:val="22"/>
-        </w:rPr>
-        <w:t xml:space="preserve">El siguiente paso es acceder </w:t>
-      </w:r>
-      <w:proofErr w:type="spellStart"/>
-      <w:r>
-        <w:rPr>
-          <w:sz w:val="22"/>
-          <w:szCs w:val="22"/>
-        </w:rPr>
-        <w:t>Hansolo</w:t>
-      </w:r>
-      <w:proofErr w:type="spellEnd"/>
-      <w:r>
-        <w:rPr>
-          <w:sz w:val="22"/>
-          <w:szCs w:val="22"/>
-        </w:rPr>
-        <w:t xml:space="preserve"> para eliminar o mover la versión antigua de la aplicación y así poder actualizar con </w:t>
-      </w:r>
-      <w:proofErr w:type="gramStart"/>
-      <w:r>
-        <w:rPr>
-          <w:sz w:val="22"/>
-          <w:szCs w:val="22"/>
-        </w:rPr>
-        <w:t>nuestra  nueva</w:t>
-      </w:r>
-      <w:proofErr w:type="gramEnd"/>
-      <w:r>
-        <w:rPr>
-          <w:sz w:val="22"/>
-          <w:szCs w:val="22"/>
-        </w:rPr>
-        <w:t xml:space="preserve"> carpeta .zip. Para ello, necesitas tener acceso a estos servidores con tu usuario y contraseña. Vamos a abrir una terminal desde </w:t>
-      </w:r>
-      <w:r>
-        <w:rPr>
-          <w:sz w:val="22"/>
-          <w:szCs w:val="22"/>
-        </w:rPr>
-        <w:lastRenderedPageBreak/>
-        <w:t xml:space="preserve">donde hemos guardado la carpeta comprimida y a ejecutar los siguientes comandos (necesitas estar conectado a un </w:t>
+        <w:t xml:space="preserve"> carpeta .zip. Para ello, necesitas tener acceso a estos servidores con tu usuario y contraseña. Vamos a abrir una terminal desde donde hemos guardado la carpeta comprimida y a ejecutar los siguientes comandos (necesitas estar conectado a un </w:t>
       </w:r>
       <w:proofErr w:type="spellStart"/>
       <w:r>
@@ -19055,7 +19683,7 @@
                     <pic:cNvPicPr/>
                   </pic:nvPicPr>
                   <pic:blipFill>
-                    <a:blip r:embed="rId66"/>
+                    <a:blip r:embed="rId71"/>
                     <a:stretch>
                       <a:fillRect/>
                     </a:stretch>
@@ -19467,7 +20095,7 @@
                     <pic:cNvPicPr/>
                   </pic:nvPicPr>
                   <pic:blipFill>
-                    <a:blip r:embed="rId67"/>
+                    <a:blip r:embed="rId72"/>
                     <a:stretch>
                       <a:fillRect/>
                     </a:stretch>
@@ -19583,6 +20211,7 @@
           <w:sz w:val="22"/>
           <w:szCs w:val="22"/>
         </w:rPr>
+        <w:lastRenderedPageBreak/>
         <w:drawing>
           <wp:inline distT="0" distB="0" distL="0" distR="0" wp14:anchorId="7954DAB9" wp14:editId="7136E95C">
             <wp:extent cx="3800475" cy="569196"/>
@@ -19599,7 +20228,7 @@
                     <pic:cNvPicPr/>
                   </pic:nvPicPr>
                   <pic:blipFill>
-                    <a:blip r:embed="rId68"/>
+                    <a:blip r:embed="rId73"/>
                     <a:stretch>
                       <a:fillRect/>
                     </a:stretch>
@@ -19803,7 +20432,6 @@
           <w:sz w:val="22"/>
           <w:szCs w:val="22"/>
         </w:rPr>
-        <w:lastRenderedPageBreak/>
         <w:drawing>
           <wp:inline distT="0" distB="0" distL="0" distR="0" wp14:anchorId="763C4169" wp14:editId="29347A88">
             <wp:extent cx="5400040" cy="1142365"/>
@@ -19820,7 +20448,7 @@
                     <pic:cNvPicPr/>
                   </pic:nvPicPr>
                   <pic:blipFill>
-                    <a:blip r:embed="rId69"/>
+                    <a:blip r:embed="rId74"/>
                     <a:stretch>
                       <a:fillRect/>
                     </a:stretch>
@@ -19965,7 +20593,7 @@
                     <pic:cNvPicPr/>
                   </pic:nvPicPr>
                   <pic:blipFill rotWithShape="1">
-                    <a:blip r:embed="rId70"/>
+                    <a:blip r:embed="rId75"/>
                     <a:srcRect t="11029"/>
                     <a:stretch>
                       <a:fillRect/>
@@ -20169,7 +20797,7 @@
                     <pic:cNvPicPr/>
                   </pic:nvPicPr>
                   <pic:blipFill>
-                    <a:blip r:embed="rId71"/>
+                    <a:blip r:embed="rId76"/>
                     <a:stretch>
                       <a:fillRect/>
                     </a:stretch>
@@ -20308,6 +20936,7 @@
           <w:sz w:val="22"/>
           <w:szCs w:val="22"/>
         </w:rPr>
+        <w:lastRenderedPageBreak/>
         <w:drawing>
           <wp:inline distT="0" distB="0" distL="0" distR="0" wp14:anchorId="71584AC7" wp14:editId="61537B65">
             <wp:extent cx="5400040" cy="1546225"/>
@@ -20324,7 +20953,7 @@
                     <pic:cNvPicPr/>
                   </pic:nvPicPr>
                   <pic:blipFill>
-                    <a:blip r:embed="rId72"/>
+                    <a:blip r:embed="rId77"/>
                     <a:stretch>
                       <a:fillRect/>
                     </a:stretch>
@@ -20414,7 +21043,6 @@
           <w:sz w:val="22"/>
           <w:szCs w:val="22"/>
         </w:rPr>
-        <w:lastRenderedPageBreak/>
         <w:t>source</w:t>
       </w:r>
       <w:proofErr w:type="spellEnd"/>
@@ -20465,8 +21093,37 @@
           <w:sz w:val="22"/>
           <w:szCs w:val="22"/>
         </w:rPr>
-        <w:t>/actívate</w:t>
-      </w:r>
+        <w:t>/</w:t>
+      </w:r>
+      <w:proofErr w:type="spellStart"/>
+      <w:r>
+        <w:rPr>
+          <w:i/>
+          <w:iCs/>
+          <w:sz w:val="22"/>
+          <w:szCs w:val="22"/>
+        </w:rPr>
+        <w:t>act</w:t>
+      </w:r>
+      <w:r>
+        <w:rPr>
+          <w:i/>
+          <w:iCs/>
+          <w:sz w:val="22"/>
+          <w:szCs w:val="22"/>
+        </w:rPr>
+        <w:t>i</w:t>
+      </w:r>
+      <w:r>
+        <w:rPr>
+          <w:i/>
+          <w:iCs/>
+          <w:sz w:val="22"/>
+          <w:szCs w:val="22"/>
+        </w:rPr>
+        <w:t>vate</w:t>
+      </w:r>
+      <w:proofErr w:type="spellEnd"/>
     </w:p>
     <w:p>
       <w:pPr>
@@ -20561,7 +21218,7 @@
                     <pic:cNvPicPr/>
                   </pic:nvPicPr>
                   <pic:blipFill>
-                    <a:blip r:embed="rId73"/>
+                    <a:blip r:embed="rId78"/>
                     <a:stretch>
                       <a:fillRect/>
                     </a:stretch>
@@ -20612,7 +21269,7 @@
         </w:rPr>
         <w:t xml:space="preserve"> </w:t>
       </w:r>
-      <w:hyperlink r:id="rId74" w:history="1">
+      <w:hyperlink r:id="rId79" w:history="1">
         <w:r>
           <w:rPr>
             <w:rStyle w:val="Hipervnculo"/>
@@ -20690,7 +21347,7 @@
                     <pic:cNvPicPr/>
                   </pic:nvPicPr>
                   <pic:blipFill>
-                    <a:blip r:embed="rId75"/>
+                    <a:blip r:embed="rId80"/>
                     <a:stretch>
                       <a:fillRect/>
                     </a:stretch>
@@ -20797,6 +21454,7 @@
           <w:sz w:val="22"/>
           <w:szCs w:val="22"/>
         </w:rPr>
+        <w:lastRenderedPageBreak/>
         <w:t>Se recomienda emplear este canal tanto para cuestiones de uso general de la herramienta como para notificar posibles errores de funcionamiento</w:t>
       </w:r>
       <w:r>
@@ -20816,7 +21474,7 @@
     </w:p>
     <w:p/>
     <w:sectPr>
-      <w:footerReference w:type="default" r:id="rId76"/>
+      <w:footerReference w:type="default" r:id="rId81"/>
       <w:pgSz w:w="11906" w:h="16838"/>
       <w:pgMar w:top="1417" w:right="1701" w:bottom="1417" w:left="1701" w:header="708" w:footer="708" w:gutter="0"/>
       <w:pgNumType w:start="0"/>
@@ -20863,7 +21521,6 @@
         <w:docPartUnique/>
       </w:docPartObj>
     </w:sdtPr>
-    <w:sdtEndPr/>
     <w:sdtContent>
       <w:p>
         <w:pPr>
@@ -25482,10 +26139,13 @@
     <w:rsid w:val="00154A32"/>
     <w:rsid w:val="001A33A9"/>
     <w:rsid w:val="001E6D66"/>
+    <w:rsid w:val="002728C7"/>
     <w:rsid w:val="002864F2"/>
     <w:rsid w:val="002A4284"/>
     <w:rsid w:val="003C1EB9"/>
     <w:rsid w:val="00446649"/>
+    <w:rsid w:val="00455362"/>
+    <w:rsid w:val="00480681"/>
     <w:rsid w:val="00491965"/>
     <w:rsid w:val="0054205E"/>
     <w:rsid w:val="005732D8"/>
@@ -25509,6 +26169,7 @@
     <w:rsid w:val="00C05452"/>
     <w:rsid w:val="00C974CD"/>
     <w:rsid w:val="00DF634A"/>
+    <w:rsid w:val="00E34863"/>
     <w:rsid w:val="00E54E5E"/>
     <w:rsid w:val="00E81A7D"/>
     <w:rsid w:val="00EA4ADC"/>

</xml_diff>